<commit_message>
[DOC] - Sprint 2 docs update
</commit_message>
<xml_diff>
--- a/docs/adrs/word/ADR-0009.docx
+++ b/docs/adrs/word/ADR-0009.docx
@@ -30,7 +30,7 @@
           <w:noProof/>
         </w:rPr>
         <w:drawing>
-          <wp:inline distT="0" distB="0" distL="0" distR="0" wp14:anchorId="0091B9DF" wp14:editId="1066A52C">
+          <wp:inline distT="0" distB="0" distL="0" distR="0" wp14:anchorId="0091B9DF" wp14:editId="6B50C93A">
             <wp:extent cx="5400040" cy="3980180"/>
             <wp:effectExtent l="0" t="0" r="0" b="0"/>
             <wp:docPr id="1953506445" name="Imagen 1" descr="Identidad corporativa - Universidad de Oviedo - uniovi.es"/>
@@ -294,15 +294,7 @@
         <w:pStyle w:val="ListaVietas"/>
       </w:pPr>
       <w:r>
-        <w:t xml:space="preserve">Las nuevas páginas y revisiones funcionales deben incorporarse directamente al sistema de i18n y no mediante textos </w:t>
-      </w:r>
-      <w:proofErr w:type="spellStart"/>
-      <w:r>
-        <w:t>hardcodeados</w:t>
-      </w:r>
-      <w:proofErr w:type="spellEnd"/>
-      <w:r>
-        <w:t>.</w:t>
+        <w:t>Las nuevas páginas y revisiones funcionales deben incorporarse directamente al sistema de i18n y no mediante textos hardcodeados.</w:t>
       </w:r>
     </w:p>
     <w:p>
@@ -511,8 +503,13 @@
         <w:t xml:space="preserve"> </w:t>
       </w:r>
       <w:r>
-        <w:t>ADR Creation</w:t>
-      </w:r>
+        <w:t xml:space="preserve">ADR </w:t>
+      </w:r>
+      <w:proofErr w:type="spellStart"/>
+      <w:r>
+        <w:t>Creation</w:t>
+      </w:r>
+      <w:proofErr w:type="spellEnd"/>
     </w:p>
     <w:sectPr>
       <w:pgSz w:w="11906" w:h="16838"/>

</xml_diff>